<commit_message>
change docx file format
</commit_message>
<xml_diff>
--- a/src/templates/input/บันทึกข้อความ.docx
+++ b/src/templates/input/บันทึกข้อความ.docx
@@ -21,7 +21,7 @@
           <w:szCs w:val="56"/>
         </w:rPr>
         <w:drawing>
-          <wp:anchor distT="0" distB="0" distL="114300" distR="114300" simplePos="0" relativeHeight="251673600" behindDoc="0" locked="0" layoutInCell="1" allowOverlap="1" wp14:anchorId="40077578" wp14:editId="09F9980A">
+          <wp:anchor distT="0" distB="0" distL="114300" distR="114300" simplePos="0" relativeHeight="251673600" behindDoc="0" locked="0" layoutInCell="1" allowOverlap="1" wp14:anchorId="40077578" wp14:editId="51F52500">
             <wp:simplePos x="0" y="0"/>
             <wp:positionH relativeFrom="margin">
               <wp:posOffset>381726</wp:posOffset>
@@ -679,14 +679,15 @@
           <w:lang w:val="af-ZA"/>
         </w:rPr>
       </w:pPr>
-      <w:r>
-        <w:rPr>
-          <w:rFonts w:ascii="TH SarabunPSK" w:hAnsi="TH SarabunPSK" w:cs="TH SarabunPSK"/>
-          <w:sz w:val="28"/>
-          <w:lang w:val="af-ZA"/>
-        </w:rPr>
-        <w:br/>
-      </w:r>
+    </w:p>
+    <w:p>
+      <w:pPr>
+        <w:ind w:left="1440"/>
+        <w:rPr>
+          <w:rFonts w:ascii="TH SarabunPSK" w:hAnsi="TH SarabunPSK" w:cs="TH SarabunPSK"/>
+          <w:sz w:val="28"/>
+        </w:rPr>
+      </w:pPr>
       <w:r>
         <w:rPr>
           <w:rFonts w:ascii="TH SarabunPSK" w:hAnsi="TH SarabunPSK" w:cs="TH SarabunPSK" w:hint="cs"/>
@@ -697,32 +698,19 @@
       </w:r>
       <w:r>
         <w:rPr>
-          <w:rFonts w:ascii="TH SarabunPSK" w:hAnsi="TH SarabunPSK" w:cs="TH SarabunPSK"/>
-          <w:sz w:val="28"/>
-          <w:lang w:val="af-ZA"/>
-        </w:rPr>
-        <w:t>.</w:t>
-      </w:r>
-      <w:r>
-        <w:rPr>
-          <w:rFonts w:ascii="TH SarabunPSK" w:hAnsi="TH SarabunPSK" w:cs="TH SarabunPSK"/>
-          <w:sz w:val="28"/>
-          <w:lang w:val="af-ZA"/>
-        </w:rPr>
-        <w:t>............</w:t>
-      </w:r>
-      <w:r>
-        <w:rPr>
-          <w:rFonts w:ascii="TH SarabunPSK" w:hAnsi="TH SarabunPSK" w:cs="TH SarabunPSK"/>
-          <w:sz w:val="28"/>
-          <w:lang w:val="af-ZA"/>
-        </w:rPr>
-        <w:t>............</w:t>
-      </w:r>
-      <w:r>
-        <w:rPr>
-          <w:rFonts w:ascii="TH SarabunPSK" w:hAnsi="TH SarabunPSK" w:cs="TH SarabunPSK"/>
-          <w:sz w:val="28"/>
+          <w:rFonts w:ascii="TH SarabunPSK" w:hAnsi="TH SarabunPSK" w:cs="TH SarabunPSK" w:hint="cs"/>
+          <w:sz w:val="28"/>
+          <w:u w:val="dotted"/>
+          <w:cs/>
+          <w:lang w:val="af-ZA"/>
+        </w:rPr>
+        <w:t xml:space="preserve">                  </w:t>
+      </w:r>
+      <w:r>
+        <w:rPr>
+          <w:rFonts w:ascii="TH SarabunPSK" w:hAnsi="TH SarabunPSK" w:cs="TH SarabunPSK"/>
+          <w:sz w:val="28"/>
+          <w:u w:val="dotted"/>
           <w:lang w:val="af-ZA"/>
         </w:rPr>
         <w:t>{f</w:t>
@@ -731,6 +719,7 @@
         <w:rPr>
           <w:rFonts w:ascii="TH SarabunPSK" w:hAnsi="TH SarabunPSK" w:cs="TH SarabunPSK"/>
           <w:sz w:val="28"/>
+          <w:u w:val="dotted"/>
           <w:lang w:val="af-ZA"/>
         </w:rPr>
         <w:t>irstname</w:t>
@@ -739,6 +728,7 @@
         <w:rPr>
           <w:rFonts w:ascii="TH SarabunPSK" w:hAnsi="TH SarabunPSK" w:cs="TH SarabunPSK"/>
           <w:sz w:val="28"/>
+          <w:u w:val="dotted"/>
           <w:lang w:val="af-ZA"/>
         </w:rPr>
         <w:t>}</w:t>
@@ -747,54 +737,25 @@
         <w:rPr>
           <w:rFonts w:ascii="TH SarabunPSK" w:hAnsi="TH SarabunPSK" w:cs="TH SarabunPSK"/>
           <w:sz w:val="28"/>
+          <w:u w:val="dotted"/>
           <w:lang w:val="af-ZA"/>
         </w:rPr>
         <w:t xml:space="preserve"> {lastname}</w:t>
       </w:r>
       <w:r>
         <w:rPr>
-          <w:rFonts w:ascii="TH SarabunPSK" w:hAnsi="TH SarabunPSK" w:cs="TH SarabunPSK"/>
-          <w:sz w:val="28"/>
-          <w:lang w:val="af-ZA"/>
-        </w:rPr>
-        <w:t>......</w:t>
-      </w:r>
-      <w:r>
-        <w:rPr>
-          <w:rFonts w:ascii="TH SarabunPSK" w:hAnsi="TH SarabunPSK" w:cs="TH SarabunPSK"/>
-          <w:sz w:val="28"/>
-          <w:lang w:val="af-ZA"/>
-        </w:rPr>
-        <w:t>.............</w:t>
-      </w:r>
-      <w:r>
-        <w:rPr>
-          <w:rFonts w:ascii="TH SarabunPSK" w:hAnsi="TH SarabunPSK" w:cs="TH SarabunPSK"/>
-          <w:sz w:val="28"/>
-          <w:lang w:val="af-ZA"/>
-        </w:rPr>
-        <w:t>.....</w:t>
-      </w:r>
-      <w:r>
-        <w:rPr>
-          <w:rFonts w:ascii="TH SarabunPSK" w:hAnsi="TH SarabunPSK" w:cs="TH SarabunPSK"/>
-          <w:sz w:val="28"/>
-          <w:lang w:val="af-ZA"/>
-        </w:rPr>
-        <w:t>..</w:t>
-      </w:r>
-      <w:r>
-        <w:rPr>
-          <w:rFonts w:ascii="TH SarabunPSK" w:hAnsi="TH SarabunPSK" w:cs="TH SarabunPSK"/>
-          <w:sz w:val="28"/>
-          <w:lang w:val="af-ZA"/>
-        </w:rPr>
-        <w:t>...</w:t>
-      </w:r>
-      <w:r>
-        <w:rPr>
           <w:rFonts w:ascii="TH SarabunPSK" w:hAnsi="TH SarabunPSK" w:cs="TH SarabunPSK" w:hint="cs"/>
           <w:sz w:val="28"/>
+          <w:u w:val="dotted"/>
+          <w:cs/>
+          <w:lang w:val="af-ZA"/>
+        </w:rPr>
+        <w:t xml:space="preserve">                </w:t>
+      </w:r>
+      <w:r>
+        <w:rPr>
+          <w:rFonts w:ascii="TH SarabunPSK" w:hAnsi="TH SarabunPSK" w:cs="TH SarabunPSK" w:hint="cs"/>
+          <w:sz w:val="28"/>
           <w:cs/>
         </w:rPr>
         <w:t>ตำแหน่ง</w:t>
@@ -803,63 +764,44 @@
         <w:rPr>
           <w:rFonts w:ascii="TH SarabunPSK" w:hAnsi="TH SarabunPSK" w:cs="TH SarabunPSK"/>
           <w:sz w:val="28"/>
-          <w:lang w:val="af-ZA"/>
-        </w:rPr>
-        <w:t>........</w:t>
-      </w:r>
-      <w:r>
-        <w:rPr>
-          <w:rFonts w:ascii="TH SarabunPSK" w:hAnsi="TH SarabunPSK" w:cs="TH SarabunPSK"/>
-          <w:sz w:val="28"/>
-          <w:lang w:val="af-ZA"/>
-        </w:rPr>
-        <w:t>.</w:t>
-      </w:r>
-      <w:r>
-        <w:rPr>
-          <w:rFonts w:ascii="TH SarabunPSK" w:hAnsi="TH SarabunPSK" w:cs="TH SarabunPSK"/>
-          <w:sz w:val="28"/>
-          <w:lang w:val="af-ZA"/>
-        </w:rPr>
-        <w:t>...</w:t>
-      </w:r>
-      <w:r>
-        <w:rPr>
-          <w:rFonts w:ascii="TH SarabunPSK" w:hAnsi="TH SarabunPSK" w:cs="TH SarabunPSK"/>
-          <w:sz w:val="28"/>
-          <w:lang w:val="af-ZA"/>
-        </w:rPr>
-        <w:t>.......{position}</w:t>
-      </w:r>
-      <w:r>
-        <w:rPr>
-          <w:rFonts w:ascii="TH SarabunPSK" w:hAnsi="TH SarabunPSK" w:cs="TH SarabunPSK"/>
-          <w:sz w:val="28"/>
-          <w:lang w:val="af-ZA"/>
-        </w:rPr>
-        <w:t>...............</w:t>
-      </w:r>
-      <w:r>
-        <w:rPr>
-          <w:rFonts w:ascii="TH SarabunPSK" w:hAnsi="TH SarabunPSK" w:cs="TH SarabunPSK"/>
-          <w:sz w:val="28"/>
-          <w:lang w:val="af-ZA"/>
-        </w:rPr>
-        <w:t>.</w:t>
-      </w:r>
-      <w:r>
-        <w:rPr>
-          <w:rFonts w:ascii="TH SarabunPSK" w:hAnsi="TH SarabunPSK" w:cs="TH SarabunPSK"/>
-          <w:sz w:val="28"/>
-          <w:lang w:val="af-ZA"/>
-        </w:rPr>
-        <w:t>....</w:t>
-      </w:r>
-      <w:r>
-        <w:rPr>
-          <w:rFonts w:ascii="TH SarabunPSK" w:hAnsi="TH SarabunPSK" w:cs="TH SarabunPSK"/>
-          <w:sz w:val="28"/>
-          <w:lang w:val="af-ZA"/>
+          <w:u w:val="dotted"/>
+          <w:lang w:val="af-ZA"/>
+        </w:rPr>
+        <w:t xml:space="preserve">               </w:t>
+      </w:r>
+      <w:r>
+        <w:rPr>
+          <w:rFonts w:ascii="TH SarabunPSK" w:hAnsi="TH SarabunPSK" w:cs="TH SarabunPSK"/>
+          <w:sz w:val="28"/>
+          <w:u w:val="dotted"/>
+          <w:lang w:val="af-ZA"/>
+        </w:rPr>
+        <w:t>{position}</w:t>
+      </w:r>
+      <w:r>
+        <w:rPr>
+          <w:rFonts w:ascii="TH SarabunPSK" w:hAnsi="TH SarabunPSK" w:cs="TH SarabunPSK" w:hint="cs"/>
+          <w:sz w:val="28"/>
+          <w:u w:val="dotted"/>
+          <w:cs/>
+          <w:lang w:val="af-ZA"/>
+        </w:rPr>
+        <w:t xml:space="preserve">         </w:t>
+      </w:r>
+      <w:r>
+        <w:rPr>
+          <w:rFonts w:ascii="TH SarabunPSK" w:hAnsi="TH SarabunPSK" w:cs="TH SarabunPSK"/>
+          <w:sz w:val="28"/>
+          <w:u w:val="dotted"/>
+          <w:lang w:val="af-ZA"/>
+        </w:rPr>
+        <w:t xml:space="preserve">  </w:t>
+      </w:r>
+      <w:r>
+        <w:rPr>
+          <w:rFonts w:ascii="TH SarabunPSK" w:hAnsi="TH SarabunPSK" w:cs="TH SarabunPSK"/>
+          <w:sz w:val="28"/>
+          <w:u w:val="dotted"/>
         </w:rPr>
         <w:t>.</w:t>
       </w:r>
@@ -884,22 +826,16 @@
         <w:rPr>
           <w:rFonts w:ascii="TH SarabunPSK" w:hAnsi="TH SarabunPSK" w:cs="TH SarabunPSK"/>
           <w:sz w:val="28"/>
-          <w:lang w:val="af-ZA"/>
-        </w:rPr>
-        <w:t>......</w:t>
-      </w:r>
-      <w:r>
-        <w:rPr>
-          <w:rFonts w:ascii="TH SarabunPSK" w:hAnsi="TH SarabunPSK" w:cs="TH SarabunPSK"/>
-          <w:sz w:val="28"/>
-          <w:lang w:val="af-ZA"/>
-        </w:rPr>
-        <w:t>.....</w:t>
-      </w:r>
-      <w:r>
-        <w:rPr>
-          <w:rFonts w:ascii="TH SarabunPSK" w:hAnsi="TH SarabunPSK" w:cs="TH SarabunPSK"/>
-          <w:sz w:val="28"/>
+          <w:u w:val="dotted"/>
+          <w:lang w:val="af-ZA"/>
+        </w:rPr>
+        <w:t xml:space="preserve">           </w:t>
+      </w:r>
+      <w:r>
+        <w:rPr>
+          <w:rFonts w:ascii="TH SarabunPSK" w:hAnsi="TH SarabunPSK" w:cs="TH SarabunPSK"/>
+          <w:sz w:val="28"/>
+          <w:u w:val="dotted"/>
           <w:lang w:val="af-ZA"/>
         </w:rPr>
         <w:t>{department}</w:t>
@@ -908,17 +844,10 @@
         <w:rPr>
           <w:rFonts w:ascii="TH SarabunPSK" w:hAnsi="TH SarabunPSK" w:cs="TH SarabunPSK"/>
           <w:sz w:val="28"/>
-          <w:lang w:val="af-ZA"/>
-        </w:rPr>
-        <w:t>..........</w:t>
-      </w:r>
-      <w:r>
-        <w:rPr>
-          <w:rFonts w:ascii="TH SarabunPSK" w:hAnsi="TH SarabunPSK" w:cs="TH SarabunPSK"/>
-          <w:sz w:val="28"/>
-          <w:lang w:val="af-ZA"/>
-        </w:rPr>
-        <w:t>..</w:t>
+          <w:u w:val="dotted"/>
+          <w:lang w:val="af-ZA"/>
+        </w:rPr>
+        <w:t xml:space="preserve">          </w:t>
       </w:r>
       <w:r>
         <w:rPr>
@@ -932,14 +861,16 @@
         <w:rPr>
           <w:rFonts w:ascii="TH SarabunPSK" w:hAnsi="TH SarabunPSK" w:cs="TH SarabunPSK"/>
           <w:sz w:val="28"/>
-          <w:lang w:val="af-ZA"/>
-        </w:rPr>
-        <w:t>...........</w:t>
-      </w:r>
-      <w:r>
-        <w:rPr>
-          <w:rFonts w:ascii="TH SarabunPSK" w:hAnsi="TH SarabunPSK" w:cs="TH SarabunPSK"/>
-          <w:sz w:val="28"/>
+          <w:u w:val="dotted"/>
+          <w:lang w:val="af-ZA"/>
+        </w:rPr>
+        <w:t xml:space="preserve">         </w:t>
+      </w:r>
+      <w:r>
+        <w:rPr>
+          <w:rFonts w:ascii="TH SarabunPSK" w:hAnsi="TH SarabunPSK" w:cs="TH SarabunPSK"/>
+          <w:sz w:val="28"/>
+          <w:u w:val="dotted"/>
           <w:lang w:val="af-ZA"/>
         </w:rPr>
         <w:t>{subjectName}</w:t>
@@ -948,9 +879,28 @@
         <w:rPr>
           <w:rFonts w:ascii="TH SarabunPSK" w:hAnsi="TH SarabunPSK" w:cs="TH SarabunPSK"/>
           <w:sz w:val="28"/>
-          <w:lang w:val="af-ZA"/>
-        </w:rPr>
-        <w:t>.............</w:t>
+          <w:u w:val="dotted"/>
+          <w:lang w:val="af-ZA"/>
+        </w:rPr>
+        <w:t xml:space="preserve">         </w:t>
+      </w:r>
+      <w:r>
+        <w:rPr>
+          <w:rFonts w:ascii="TH SarabunPSK" w:hAnsi="TH SarabunPSK" w:cs="TH SarabunPSK" w:hint="cs"/>
+          <w:sz w:val="28"/>
+          <w:u w:val="dotted"/>
+          <w:cs/>
+          <w:lang w:val="af-ZA"/>
+        </w:rPr>
+        <w:t xml:space="preserve"> </w:t>
+      </w:r>
+      <w:r>
+        <w:rPr>
+          <w:rFonts w:ascii="TH SarabunPSK" w:hAnsi="TH SarabunPSK" w:cs="TH SarabunPSK"/>
+          <w:sz w:val="28"/>
+          <w:u w:val="dotted"/>
+        </w:rPr>
+        <w:t>.</w:t>
       </w:r>
       <w:r>
         <w:rPr>
@@ -966,37 +916,30 @@
           <w:sz w:val="28"/>
           <w:cs/>
         </w:rPr>
-        <w:t>หมู่บรรยาย</w:t>
-      </w:r>
-      <w:r>
-        <w:rPr>
-          <w:rFonts w:ascii="TH SarabunPSK" w:hAnsi="TH SarabunPSK" w:cs="TH SarabunPSK"/>
-          <w:sz w:val="28"/>
-          <w:lang w:val="af-ZA"/>
-        </w:rPr>
-        <w:t>…</w:t>
-      </w:r>
-      <w:r>
-        <w:rPr>
-          <w:rFonts w:ascii="TH SarabunPSK" w:hAnsi="TH SarabunPSK" w:cs="TH SarabunPSK"/>
-          <w:sz w:val="28"/>
-          <w:lang w:val="af-ZA"/>
-        </w:rPr>
-        <w:t>..</w:t>
+        <w:t>หมู่บรรยา</w:t>
       </w:r>
       <w:r>
         <w:rPr>
           <w:rFonts w:ascii="TH SarabunPSK" w:hAnsi="TH SarabunPSK" w:cs="TH SarabunPSK" w:hint="cs"/>
           <w:sz w:val="28"/>
           <w:cs/>
-          <w:lang w:val="af-ZA"/>
-        </w:rPr>
-        <w:t xml:space="preserve"> </w:t>
-      </w:r>
-      <w:r>
-        <w:rPr>
-          <w:rFonts w:ascii="TH SarabunPSK" w:hAnsi="TH SarabunPSK" w:cs="TH SarabunPSK"/>
-          <w:sz w:val="28"/>
+        </w:rPr>
+        <w:t xml:space="preserve">ย </w:t>
+      </w:r>
+      <w:r>
+        <w:rPr>
+          <w:rFonts w:ascii="TH SarabunPSK" w:hAnsi="TH SarabunPSK" w:cs="TH SarabunPSK" w:hint="cs"/>
+          <w:sz w:val="28"/>
+          <w:u w:val="dotted"/>
+          <w:cs/>
+        </w:rPr>
+        <w:t xml:space="preserve">        </w:t>
+      </w:r>
+      <w:r>
+        <w:rPr>
+          <w:rFonts w:ascii="TH SarabunPSK" w:hAnsi="TH SarabunPSK" w:cs="TH SarabunPSK"/>
+          <w:sz w:val="28"/>
+          <w:u w:val="dotted"/>
           <w:lang w:val="af-ZA"/>
         </w:rPr>
         <w:t>{lectureId}</w:t>
@@ -1005,42 +948,11 @@
         <w:rPr>
           <w:rFonts w:ascii="TH SarabunPSK" w:hAnsi="TH SarabunPSK" w:cs="TH SarabunPSK" w:hint="cs"/>
           <w:sz w:val="28"/>
-          <w:cs/>
-          <w:lang w:val="af-ZA"/>
-        </w:rPr>
-        <w:t xml:space="preserve"> </w:t>
-      </w:r>
-      <w:r>
-        <w:rPr>
-          <w:rFonts w:ascii="TH SarabunPSK" w:hAnsi="TH SarabunPSK" w:cs="TH SarabunPSK"/>
-          <w:sz w:val="28"/>
-          <w:lang w:val="af-ZA"/>
-        </w:rPr>
-        <w:t>.</w:t>
-      </w:r>
-      <w:r>
-        <w:rPr>
-          <w:rFonts w:ascii="TH SarabunPSK" w:hAnsi="TH SarabunPSK" w:cs="TH SarabunPSK"/>
-          <w:sz w:val="28"/>
-          <w:lang w:val="af-ZA"/>
-        </w:rPr>
-        <w:t>.</w:t>
-      </w:r>
-      <w:r>
-        <w:rPr>
-          <w:rFonts w:ascii="TH SarabunPSK" w:hAnsi="TH SarabunPSK" w:cs="TH SarabunPSK"/>
-          <w:sz w:val="28"/>
-          <w:lang w:val="af-ZA"/>
-        </w:rPr>
-        <w:t>..</w:t>
-      </w:r>
-      <w:r>
-        <w:rPr>
-          <w:rFonts w:ascii="TH SarabunPSK" w:hAnsi="TH SarabunPSK" w:cs="TH SarabunPSK"/>
-          <w:sz w:val="28"/>
-          <w:lang w:val="af-ZA"/>
-        </w:rPr>
-        <w:t>.</w:t>
+          <w:u w:val="dotted"/>
+          <w:cs/>
+          <w:lang w:val="af-ZA"/>
+        </w:rPr>
+        <w:t xml:space="preserve">       </w:t>
       </w:r>
       <w:r>
         <w:rPr>
@@ -1054,30 +966,16 @@
         <w:rPr>
           <w:rFonts w:ascii="TH SarabunPSK" w:hAnsi="TH SarabunPSK" w:cs="TH SarabunPSK"/>
           <w:sz w:val="28"/>
-          <w:lang w:val="af-ZA"/>
-        </w:rPr>
-        <w:t>..</w:t>
-      </w:r>
-      <w:r>
-        <w:rPr>
-          <w:rFonts w:ascii="TH SarabunPSK" w:hAnsi="TH SarabunPSK" w:cs="TH SarabunPSK"/>
-          <w:sz w:val="28"/>
-          <w:lang w:val="af-ZA"/>
-        </w:rPr>
-        <w:t>..</w:t>
-      </w:r>
-      <w:r>
-        <w:rPr>
-          <w:rFonts w:ascii="TH SarabunPSK" w:hAnsi="TH SarabunPSK" w:cs="TH SarabunPSK"/>
-          <w:sz w:val="28"/>
-          <w:lang w:val="af-ZA"/>
-        </w:rPr>
-        <w:t>..</w:t>
-      </w:r>
-      <w:r>
-        <w:rPr>
-          <w:rFonts w:ascii="TH SarabunPSK" w:hAnsi="TH SarabunPSK" w:cs="TH SarabunPSK"/>
-          <w:sz w:val="28"/>
+          <w:u w:val="dotted"/>
+          <w:lang w:val="af-ZA"/>
+        </w:rPr>
+        <w:t xml:space="preserve">      </w:t>
+      </w:r>
+      <w:r>
+        <w:rPr>
+          <w:rFonts w:ascii="TH SarabunPSK" w:hAnsi="TH SarabunPSK" w:cs="TH SarabunPSK"/>
+          <w:sz w:val="28"/>
+          <w:u w:val="dotted"/>
           <w:lang w:val="af-ZA"/>
         </w:rPr>
         <w:t>{labId}</w:t>
@@ -1086,40 +984,10 @@
         <w:rPr>
           <w:rFonts w:ascii="TH SarabunPSK" w:hAnsi="TH SarabunPSK" w:cs="TH SarabunPSK"/>
           <w:sz w:val="28"/>
-          <w:lang w:val="af-ZA"/>
-        </w:rPr>
-        <w:t>.</w:t>
-      </w:r>
-      <w:r>
-        <w:rPr>
-          <w:rFonts w:ascii="TH SarabunPSK" w:hAnsi="TH SarabunPSK" w:cs="TH SarabunPSK"/>
-          <w:sz w:val="28"/>
-          <w:lang w:val="af-ZA"/>
-        </w:rPr>
-        <w:t>.</w:t>
-      </w:r>
-      <w:r>
-        <w:rPr>
-          <w:rFonts w:ascii="TH SarabunPSK" w:hAnsi="TH SarabunPSK" w:cs="TH SarabunPSK"/>
-          <w:sz w:val="28"/>
-          <w:lang w:val="af-ZA"/>
-        </w:rPr>
-        <w:t>..</w:t>
-      </w:r>
-      <w:r>
-        <w:rPr>
-          <w:rFonts w:ascii="TH SarabunPSK" w:hAnsi="TH SarabunPSK" w:cs="TH SarabunPSK"/>
-          <w:sz w:val="28"/>
-          <w:lang w:val="af-ZA"/>
-        </w:rPr>
-        <w:t>.</w:t>
-      </w:r>
-      <w:r>
-        <w:rPr>
-          <w:rFonts w:ascii="TH SarabunPSK" w:hAnsi="TH SarabunPSK" w:cs="TH SarabunPSK"/>
-          <w:sz w:val="28"/>
-        </w:rPr>
-        <w:t>.</w:t>
+          <w:u w:val="dotted"/>
+          <w:lang w:val="af-ZA"/>
+        </w:rPr>
+        <w:t xml:space="preserve">      </w:t>
       </w:r>
       <w:r>
         <w:rPr>
@@ -1180,24 +1048,26 @@
         <w:rPr>
           <w:rFonts w:ascii="TH SarabunPSK" w:hAnsi="TH SarabunPSK" w:cs="TH SarabunPSK"/>
           <w:sz w:val="28"/>
-          <w:lang w:val="af-ZA"/>
-        </w:rPr>
-        <w:t>.......</w:t>
-      </w:r>
-      <w:r>
-        <w:rPr>
-          <w:rFonts w:ascii="TH SarabunPSK" w:hAnsi="TH SarabunPSK" w:cs="TH SarabunPSK"/>
-          <w:sz w:val="28"/>
+          <w:u w:val="dotted"/>
+          <w:lang w:val="af-ZA"/>
+        </w:rPr>
+        <w:t xml:space="preserve">     </w:t>
+      </w:r>
+      <w:r>
+        <w:rPr>
+          <w:rFonts w:ascii="TH SarabunPSK" w:hAnsi="TH SarabunPSK" w:cs="TH SarabunPSK"/>
+          <w:sz w:val="28"/>
+          <w:u w:val="dotted"/>
           <w:lang w:val="af-ZA"/>
         </w:rPr>
         <w:t>{</w:t>
       </w:r>
       <w:proofErr w:type="spellStart"/>
-      <w:proofErr w:type="gramStart"/>
-      <w:r>
-        <w:rPr>
-          <w:rFonts w:ascii="TH SarabunPSK" w:hAnsi="TH SarabunPSK" w:cs="TH SarabunPSK"/>
-          <w:sz w:val="28"/>
+      <w:r>
+        <w:rPr>
+          <w:rFonts w:ascii="TH SarabunPSK" w:hAnsi="TH SarabunPSK" w:cs="TH SarabunPSK"/>
+          <w:sz w:val="28"/>
+          <w:u w:val="dotted"/>
         </w:rPr>
         <w:t>previousDate</w:t>
       </w:r>
@@ -1206,6 +1076,7 @@
         <w:rPr>
           <w:rFonts w:ascii="TH SarabunPSK" w:hAnsi="TH SarabunPSK" w:cs="TH SarabunPSK"/>
           <w:sz w:val="28"/>
+          <w:u w:val="dotted"/>
         </w:rPr>
         <w:t>}</w:t>
       </w:r>
@@ -1213,27 +1084,11 @@
         <w:rPr>
           <w:rFonts w:ascii="TH SarabunPSK" w:hAnsi="TH SarabunPSK" w:cs="TH SarabunPSK"/>
           <w:sz w:val="28"/>
-          <w:lang w:val="af-ZA"/>
-        </w:rPr>
-        <w:t>...</w:t>
-      </w:r>
-      <w:r>
-        <w:rPr>
-          <w:rFonts w:ascii="TH SarabunPSK" w:hAnsi="TH SarabunPSK" w:cs="TH SarabunPSK"/>
-          <w:sz w:val="28"/>
-          <w:lang w:val="af-ZA"/>
-        </w:rPr>
-        <w:t>...</w:t>
-      </w:r>
-      <w:r>
-        <w:rPr>
-          <w:rFonts w:ascii="TH SarabunPSK" w:hAnsi="TH SarabunPSK" w:cs="TH SarabunPSK"/>
-          <w:sz w:val="28"/>
-          <w:lang w:val="af-ZA"/>
-        </w:rPr>
-        <w:t>..</w:t>
-      </w:r>
-      <w:proofErr w:type="gramEnd"/>
+          <w:u w:val="dotted"/>
+          <w:lang w:val="af-ZA"/>
+        </w:rPr>
+        <w:t xml:space="preserve">    </w:t>
+      </w:r>
       <w:r>
         <w:rPr>
           <w:rFonts w:ascii="TH SarabunPSK" w:hAnsi="TH SarabunPSK" w:cs="TH SarabunPSK"/>
@@ -1254,22 +1109,16 @@
         <w:rPr>
           <w:rFonts w:ascii="TH SarabunPSK" w:hAnsi="TH SarabunPSK" w:cs="TH SarabunPSK"/>
           <w:sz w:val="28"/>
-          <w:lang w:val="af-ZA"/>
-        </w:rPr>
-        <w:t>.........</w:t>
-      </w:r>
-      <w:r>
-        <w:rPr>
-          <w:rFonts w:ascii="TH SarabunPSK" w:hAnsi="TH SarabunPSK" w:cs="TH SarabunPSK"/>
-          <w:sz w:val="28"/>
-          <w:lang w:val="af-ZA"/>
-        </w:rPr>
-        <w:t>.</w:t>
-      </w:r>
-      <w:r>
-        <w:rPr>
-          <w:rFonts w:ascii="TH SarabunPSK" w:hAnsi="TH SarabunPSK" w:cs="TH SarabunPSK"/>
-          <w:sz w:val="28"/>
+          <w:u w:val="dotted"/>
+          <w:lang w:val="af-ZA"/>
+        </w:rPr>
+        <w:t xml:space="preserve">       </w:t>
+      </w:r>
+      <w:r>
+        <w:rPr>
+          <w:rFonts w:ascii="TH SarabunPSK" w:hAnsi="TH SarabunPSK" w:cs="TH SarabunPSK"/>
+          <w:sz w:val="28"/>
+          <w:u w:val="dotted"/>
           <w:lang w:val="af-ZA"/>
         </w:rPr>
         <w:t>{previousTime}</w:t>
@@ -1278,25 +1127,10 @@
         <w:rPr>
           <w:rFonts w:ascii="TH SarabunPSK" w:hAnsi="TH SarabunPSK" w:cs="TH SarabunPSK"/>
           <w:sz w:val="28"/>
-          <w:lang w:val="af-ZA"/>
-        </w:rPr>
-        <w:t>.</w:t>
-      </w:r>
-      <w:r>
-        <w:rPr>
-          <w:rFonts w:ascii="TH SarabunPSK" w:hAnsi="TH SarabunPSK" w:cs="TH SarabunPSK"/>
-          <w:sz w:val="28"/>
-          <w:lang w:val="af-ZA"/>
-        </w:rPr>
-        <w:t>....</w:t>
-      </w:r>
-      <w:r>
-        <w:rPr>
-          <w:rFonts w:ascii="TH SarabunPSK" w:hAnsi="TH SarabunPSK" w:cs="TH SarabunPSK"/>
-          <w:sz w:val="28"/>
-          <w:lang w:val="af-ZA"/>
-        </w:rPr>
-        <w:t>...</w:t>
+          <w:u w:val="dotted"/>
+          <w:lang w:val="af-ZA"/>
+        </w:rPr>
+        <w:t xml:space="preserve">      </w:t>
       </w:r>
       <w:r>
         <w:rPr>
@@ -1310,30 +1144,16 @@
         <w:rPr>
           <w:rFonts w:ascii="TH SarabunPSK" w:hAnsi="TH SarabunPSK" w:cs="TH SarabunPSK"/>
           <w:sz w:val="28"/>
-          <w:lang w:val="af-ZA"/>
-        </w:rPr>
-        <w:t>.</w:t>
-      </w:r>
-      <w:r>
-        <w:rPr>
-          <w:rFonts w:ascii="TH SarabunPSK" w:hAnsi="TH SarabunPSK" w:cs="TH SarabunPSK"/>
-          <w:sz w:val="28"/>
-          <w:lang w:val="af-ZA"/>
-        </w:rPr>
-        <w:t>..</w:t>
-      </w:r>
-      <w:r>
-        <w:rPr>
-          <w:rFonts w:ascii="TH SarabunPSK" w:hAnsi="TH SarabunPSK" w:cs="TH SarabunPSK"/>
-          <w:sz w:val="28"/>
-          <w:lang w:val="af-ZA"/>
-        </w:rPr>
-        <w:t>....</w:t>
-      </w:r>
-      <w:r>
-        <w:rPr>
-          <w:rFonts w:ascii="TH SarabunPSK" w:hAnsi="TH SarabunPSK" w:cs="TH SarabunPSK"/>
-          <w:sz w:val="28"/>
+          <w:u w:val="dotted"/>
+          <w:lang w:val="af-ZA"/>
+        </w:rPr>
+        <w:t xml:space="preserve">      </w:t>
+      </w:r>
+      <w:r>
+        <w:rPr>
+          <w:rFonts w:ascii="TH SarabunPSK" w:hAnsi="TH SarabunPSK" w:cs="TH SarabunPSK"/>
+          <w:sz w:val="28"/>
+          <w:u w:val="dotted"/>
           <w:lang w:val="af-ZA"/>
         </w:rPr>
         <w:t>{newDate}</w:t>
@@ -1342,41 +1162,10 @@
         <w:rPr>
           <w:rFonts w:ascii="TH SarabunPSK" w:hAnsi="TH SarabunPSK" w:cs="TH SarabunPSK"/>
           <w:sz w:val="28"/>
-          <w:lang w:val="af-ZA"/>
-        </w:rPr>
-        <w:t>...</w:t>
-      </w:r>
-      <w:r>
-        <w:rPr>
-          <w:rFonts w:ascii="TH SarabunPSK" w:hAnsi="TH SarabunPSK" w:cs="TH SarabunPSK"/>
-          <w:sz w:val="28"/>
-          <w:lang w:val="af-ZA"/>
-        </w:rPr>
-        <w:t>.</w:t>
-      </w:r>
-      <w:r>
-        <w:rPr>
-          <w:rFonts w:ascii="TH SarabunPSK" w:hAnsi="TH SarabunPSK" w:cs="TH SarabunPSK"/>
-          <w:sz w:val="28"/>
-          <w:lang w:val="af-ZA"/>
-        </w:rPr>
-        <w:t>..</w:t>
-      </w:r>
-      <w:r>
-        <w:rPr>
-          <w:rFonts w:ascii="TH SarabunPSK" w:hAnsi="TH SarabunPSK" w:cs="TH SarabunPSK"/>
-          <w:sz w:val="28"/>
-          <w:lang w:val="af-ZA"/>
-        </w:rPr>
-        <w:t>..</w:t>
-      </w:r>
-      <w:r>
-        <w:rPr>
-          <w:rFonts w:ascii="TH SarabunPSK" w:hAnsi="TH SarabunPSK" w:cs="TH SarabunPSK"/>
-          <w:sz w:val="28"/>
-          <w:lang w:val="af-ZA"/>
-        </w:rPr>
-        <w:t>..</w:t>
+          <w:u w:val="dotted"/>
+          <w:lang w:val="af-ZA"/>
+        </w:rPr>
+        <w:t xml:space="preserve">     </w:t>
       </w:r>
       <w:r>
         <w:rPr>
@@ -1398,21 +1187,16 @@
         <w:rPr>
           <w:rFonts w:ascii="TH SarabunPSK" w:hAnsi="TH SarabunPSK" w:cs="TH SarabunPSK"/>
           <w:sz w:val="28"/>
-          <w:lang w:val="af-ZA"/>
-        </w:rPr>
-        <w:t>...</w:t>
-      </w:r>
-      <w:r>
-        <w:rPr>
-          <w:rFonts w:ascii="TH SarabunPSK" w:hAnsi="TH SarabunPSK" w:cs="TH SarabunPSK"/>
-          <w:sz w:val="28"/>
-        </w:rPr>
-        <w:t>.</w:t>
-      </w:r>
-      <w:r>
-        <w:rPr>
-          <w:rFonts w:ascii="TH SarabunPSK" w:hAnsi="TH SarabunPSK" w:cs="TH SarabunPSK"/>
-          <w:sz w:val="28"/>
+          <w:u w:val="dotted"/>
+          <w:lang w:val="af-ZA"/>
+        </w:rPr>
+        <w:t xml:space="preserve">    </w:t>
+      </w:r>
+      <w:r>
+        <w:rPr>
+          <w:rFonts w:ascii="TH SarabunPSK" w:hAnsi="TH SarabunPSK" w:cs="TH SarabunPSK"/>
+          <w:sz w:val="28"/>
+          <w:u w:val="dotted"/>
           <w:lang w:val="af-ZA"/>
         </w:rPr>
         <w:t>{newTime}</w:t>
@@ -1421,33 +1205,18 @@
         <w:rPr>
           <w:rFonts w:ascii="TH SarabunPSK" w:hAnsi="TH SarabunPSK" w:cs="TH SarabunPSK"/>
           <w:sz w:val="28"/>
-          <w:lang w:val="af-ZA"/>
-        </w:rPr>
-        <w:t>.</w:t>
-      </w:r>
-      <w:r>
-        <w:rPr>
-          <w:rFonts w:ascii="TH SarabunPSK" w:hAnsi="TH SarabunPSK" w:cs="TH SarabunPSK"/>
-          <w:sz w:val="28"/>
-          <w:lang w:val="af-ZA"/>
-        </w:rPr>
-        <w:t>.</w:t>
-      </w:r>
-      <w:r>
-        <w:rPr>
-          <w:rFonts w:ascii="TH SarabunPSK" w:hAnsi="TH SarabunPSK" w:cs="TH SarabunPSK"/>
-          <w:sz w:val="28"/>
-          <w:lang w:val="af-ZA"/>
-        </w:rPr>
-        <w:t>...</w:t>
-      </w:r>
-      <w:r>
-        <w:rPr>
-          <w:rFonts w:ascii="TH SarabunPSK" w:hAnsi="TH SarabunPSK" w:cs="TH SarabunPSK"/>
-          <w:sz w:val="28"/>
-          <w:lang w:val="af-ZA"/>
-        </w:rPr>
-        <w:t xml:space="preserve"> {/compensation}</w:t>
+          <w:u w:val="dotted"/>
+          <w:lang w:val="af-ZA"/>
+        </w:rPr>
+        <w:t xml:space="preserve">     . </w:t>
+      </w:r>
+      <w:r>
+        <w:rPr>
+          <w:rFonts w:ascii="TH SarabunPSK" w:hAnsi="TH SarabunPSK" w:cs="TH SarabunPSK"/>
+          <w:sz w:val="28"/>
+          <w:lang w:val="af-ZA"/>
+        </w:rPr>
+        <w:t>{/compensation}</w:t>
       </w:r>
     </w:p>
     <w:p>
@@ -1511,72 +1280,99 @@
         <w:rPr>
           <w:rFonts w:ascii="TH SarabunPSK" w:hAnsi="TH SarabunPSK" w:cs="TH SarabunPSK"/>
           <w:sz w:val="28"/>
-        </w:rPr>
-        <w:t>……………</w:t>
-      </w:r>
-      <w:r>
-        <w:rPr>
-          <w:rFonts w:ascii="TH SarabunPSK" w:hAnsi="TH SarabunPSK" w:cs="TH SarabunPSK"/>
-          <w:sz w:val="28"/>
-        </w:rPr>
-        <w:t>{reason}</w:t>
-      </w:r>
-      <w:r>
-        <w:rPr>
-          <w:rFonts w:ascii="TH SarabunPSK" w:hAnsi="TH SarabunPSK" w:cs="TH SarabunPSK"/>
-          <w:sz w:val="28"/>
-        </w:rPr>
-        <w:t>………………….</w:t>
-      </w:r>
-      <w:r>
-        <w:rPr>
-          <w:rFonts w:ascii="TH SarabunPSK" w:hAnsi="TH SarabunPSK" w:cs="TH SarabunPSK"/>
-          <w:sz w:val="28"/>
-        </w:rPr>
-        <w:t>……….....</w:t>
-      </w:r>
-      <w:r>
-        <w:rPr>
-          <w:rFonts w:ascii="TH SarabunPSK" w:hAnsi="TH SarabunPSK" w:cs="TH SarabunPSK"/>
-          <w:sz w:val="28"/>
-        </w:rPr>
-        <w:t>......................</w:t>
-      </w:r>
-      <w:r>
-        <w:rPr>
-          <w:rFonts w:ascii="TH SarabunPSK" w:hAnsi="TH SarabunPSK" w:cs="TH SarabunPSK"/>
-          <w:sz w:val="28"/>
+          <w:u w:val="dotted"/>
+          <w:lang w:val="af-ZA"/>
+        </w:rPr>
+        <w:t xml:space="preserve">                                                                                    </w:t>
+      </w:r>
+      <w:r>
+        <w:rPr>
+          <w:rFonts w:ascii="TH SarabunPSK" w:hAnsi="TH SarabunPSK" w:cs="TH SarabunPSK"/>
+          <w:sz w:val="28"/>
+          <w:lang w:val="af-ZA"/>
         </w:rPr>
         <w:t>.</w:t>
       </w:r>
-      <w:r>
-        <w:rPr>
-          <w:rFonts w:ascii="TH SarabunPSK" w:hAnsi="TH SarabunPSK" w:cs="TH SarabunPSK"/>
-          <w:sz w:val="28"/>
-        </w:rPr>
-        <w:t>.........</w:t>
-      </w:r>
-      <w:r>
-        <w:rPr>
-          <w:rFonts w:ascii="TH SarabunPSK" w:hAnsi="TH SarabunPSK" w:cs="TH SarabunPSK"/>
-          <w:sz w:val="28"/>
-        </w:rPr>
-        <w:t>…………………………………………………………………………………………………………..…………</w:t>
-      </w:r>
-      <w:r>
-        <w:rPr>
-          <w:rFonts w:ascii="TH SarabunPSK" w:hAnsi="TH SarabunPSK" w:cs="TH SarabunPSK"/>
-          <w:sz w:val="28"/>
-        </w:rPr>
-        <w:t>.…</w:t>
-      </w:r>
-      <w:r>
-        <w:rPr>
-          <w:rFonts w:ascii="TH SarabunPSK" w:hAnsi="TH SarabunPSK" w:cs="TH SarabunPSK"/>
-          <w:sz w:val="28"/>
-        </w:rPr>
-        <w:t>……………………………………………………………………………………………………………………………………</w:t>
-      </w:r>
+    </w:p>
+    <w:p>
+      <w:pPr>
+        <w:ind w:left="720"/>
+        <w:rPr>
+          <w:rFonts w:ascii="TH SarabunPSK" w:hAnsi="TH SarabunPSK" w:cs="TH SarabunPSK"/>
+          <w:sz w:val="28"/>
+          <w:u w:val="dotted"/>
+        </w:rPr>
+      </w:pPr>
+      <w:r>
+        <w:rPr>
+          <w:rFonts w:ascii="TH SarabunPSK" w:hAnsi="TH SarabunPSK" w:cs="TH SarabunPSK"/>
+          <w:sz w:val="28"/>
+          <w:u w:val="dotted"/>
+        </w:rPr>
+        <w:t xml:space="preserve">             </w:t>
+      </w:r>
+      <w:r>
+        <w:rPr>
+          <w:rFonts w:ascii="TH SarabunPSK" w:hAnsi="TH SarabunPSK" w:cs="TH SarabunPSK"/>
+          <w:sz w:val="28"/>
+          <w:u w:val="dotted"/>
+        </w:rPr>
+        <w:t>{</w:t>
+      </w:r>
+      <w:proofErr w:type="gramStart"/>
+      <w:r>
+        <w:rPr>
+          <w:rFonts w:ascii="TH SarabunPSK" w:hAnsi="TH SarabunPSK" w:cs="TH SarabunPSK"/>
+          <w:sz w:val="28"/>
+          <w:u w:val="dotted"/>
+        </w:rPr>
+        <w:t>reason</w:t>
+      </w:r>
+      <w:r>
+        <w:rPr>
+          <w:rFonts w:ascii="TH SarabunPSK" w:hAnsi="TH SarabunPSK" w:cs="TH SarabunPSK"/>
+          <w:sz w:val="28"/>
+          <w:u w:val="dotted"/>
+        </w:rPr>
+        <w:t xml:space="preserve">}   </w:t>
+      </w:r>
+      <w:proofErr w:type="gramEnd"/>
+      <w:r>
+        <w:rPr>
+          <w:rFonts w:ascii="TH SarabunPSK" w:hAnsi="TH SarabunPSK" w:cs="TH SarabunPSK"/>
+          <w:sz w:val="28"/>
+          <w:u w:val="dotted"/>
+        </w:rPr>
+        <w:t xml:space="preserve">            </w:t>
+      </w:r>
+      <w:r>
+        <w:rPr>
+          <w:rFonts w:ascii="TH SarabunPSK" w:hAnsi="TH SarabunPSK" w:cs="TH SarabunPSK"/>
+          <w:sz w:val="28"/>
+          <w:u w:val="dotted"/>
+        </w:rPr>
+        <w:t xml:space="preserve">  </w:t>
+      </w:r>
+      <w:proofErr w:type="gramStart"/>
+      <w:r>
+        <w:rPr>
+          <w:rFonts w:ascii="TH SarabunPSK" w:hAnsi="TH SarabunPSK" w:cs="TH SarabunPSK"/>
+          <w:sz w:val="28"/>
+          <w:u w:val="dotted"/>
+        </w:rPr>
+        <w:t xml:space="preserve">  .</w:t>
+      </w:r>
+      <w:proofErr w:type="gramEnd"/>
+    </w:p>
+    <w:p>
+      <w:pPr>
+        <w:ind w:left="720"/>
+        <w:rPr>
+          <w:rFonts w:ascii="TH SarabunPSK" w:hAnsi="TH SarabunPSK" w:cs="TH SarabunPSK"/>
+          <w:sz w:val="28"/>
+          <w:lang w:val="af-ZA"/>
+        </w:rPr>
+      </w:pPr>
       <w:r>
         <w:rPr>
           <w:rFonts w:ascii="TH SarabunPSK" w:hAnsi="TH SarabunPSK" w:cs="TH SarabunPSK"/>
@@ -1678,15 +1474,33 @@
           <w:lang w:val="af-ZA"/>
         </w:rPr>
         <w:tab/>
-        <w:t xml:space="preserve">       </w:t>
-      </w:r>
-      <w:r>
-        <w:rPr>
-          <w:rFonts w:ascii="TH SarabunPSK" w:hAnsi="TH SarabunPSK" w:cs="TH SarabunPSK"/>
-          <w:sz w:val="28"/>
-          <w:lang w:val="af-ZA"/>
-        </w:rPr>
-        <w:t>(....................................................)</w:t>
+        <w:t xml:space="preserve">    </w:t>
+      </w:r>
+      <w:proofErr w:type="gramStart"/>
+      <w:r>
+        <w:rPr>
+          <w:rFonts w:ascii="TH SarabunPSK" w:hAnsi="TH SarabunPSK" w:cs="TH SarabunPSK"/>
+          <w:sz w:val="28"/>
+          <w:lang w:val="af-ZA"/>
+        </w:rPr>
+        <w:t xml:space="preserve">   </w:t>
+      </w:r>
+      <w:r>
+        <w:rPr>
+          <w:rFonts w:ascii="TH SarabunPSK" w:hAnsi="TH SarabunPSK" w:cs="TH SarabunPSK"/>
+          <w:sz w:val="28"/>
+          <w:lang w:val="af-ZA"/>
+        </w:rPr>
+        <w:t>(</w:t>
+      </w:r>
+      <w:proofErr w:type="gramEnd"/>
+      <w:r>
+        <w:rPr>
+          <w:rFonts w:ascii="TH SarabunPSK" w:hAnsi="TH SarabunPSK" w:cs="TH SarabunPSK"/>
+          <w:sz w:val="28"/>
+          <w:lang w:val="af-ZA"/>
+        </w:rPr>
+        <w:t>....................................................)</w:t>
       </w:r>
     </w:p>
     <w:tbl>

</xml_diff>